<commit_message>
M1: tie วัตถุประสงค์/เนื้อหา to mapped CLOs, fix multi-line content rendering
</commit_message>
<xml_diff>
--- a/render_proof.docx
+++ b/render_proof.docx
@@ -555,7 +555,7 @@
               <w:jc w:val="left"/>
             </w:pPr>
             <w:r>
-              <w:t xml:space="preserve">ภาพรวมระบบประสาทอัตโนมัติ</w:t>
+              <w:t xml:space="preserve">อธิบายโครงสร้างและการจำแนกประเภทของระบบประสาทอัตโนมัติได้</w:t>
             </w:r>
             <w:r>
               <w:rPr>
@@ -590,7 +590,19 @@
               <w:jc w:val="left"/>
             </w:pPr>
             <w:r>
-              <w:t xml:space="preserve">โครงสร้างพื้นฐานของ ANS, แบ่ง sympathetic/parasympathetic</w:t>
+              <w:t xml:space="preserve"/>
+            </w:r>
+            <w:r>
+              <w:t xml:space="preserve">1. หน้าที่และภาพรวมของ ANS</w:t>
+            </w:r>
+            <w:r>
+              <w:br/>
+            </w:r>
+            <w:r>
+              <w:t xml:space="preserve">2. การแบ่ง sympathetic และ parasympathetic</w:t>
+            </w:r>
+            <w:r>
+              <w:t xml:space="preserve"/>
             </w:r>
             <w:r>
               <w:rPr>
@@ -875,7 +887,7 @@
               <w:jc w:val="left"/>
             </w:pPr>
             <w:r>
-              <w:t xml:space="preserve">Sympathetic vs Parasympathetic</w:t>
+              <w:t xml:space="preserve">วิเคราะห์ความแตกต่างระหว่าง sympathetic และ parasympathetic ได้</w:t>
             </w:r>
             <w:r>
               <w:rPr>
@@ -910,7 +922,19 @@
               <w:jc w:val="left"/>
             </w:pPr>
             <w:r>
-              <w:t xml:space="preserve">เปรียบเทียบ neurotransmitter, receptor และผลต่ออวัยวะเป้าหมาย</w:t>
+              <w:t xml:space="preserve"/>
+            </w:r>
+            <w:r>
+              <w:t xml:space="preserve">1. Neurotransmitter และ receptor ของแต่ละระบบ</w:t>
+            </w:r>
+            <w:r>
+              <w:br/>
+            </w:r>
+            <w:r>
+              <w:t xml:space="preserve">2. ผลต่ออวัยวะเป้าหมาย</w:t>
+            </w:r>
+            <w:r>
+              <w:t xml:space="preserve"/>
             </w:r>
             <w:r>
               <w:rPr>
@@ -1195,7 +1219,7 @@
               <w:jc w:val="left"/>
             </w:pPr>
             <w:r>
-              <w:t xml:space="preserve">กรณีศึกษาทางคลินิก</w:t>
+              <w:t xml:space="preserve">ประยุกต์ความรู้โครงสร้างและความแตกต่างของ ANS กับอาการผู้ป่วยตัวอย่างได้</w:t>
             </w:r>
             <w:r>
               <w:rPr>
@@ -1230,7 +1254,19 @@
               <w:jc w:val="left"/>
             </w:pPr>
             <w:r>
-              <w:t xml:space="preserve">ประยุกต์ความรู้ ANS กับอาการผู้ป่วยตัวอย่าง</w:t>
+              <w:t xml:space="preserve"/>
+            </w:r>
+            <w:r>
+              <w:t xml:space="preserve">1. เคสตัวอย่างที่เกี่ยวข้องกับ ANS</w:t>
+            </w:r>
+            <w:r>
+              <w:br/>
+            </w:r>
+            <w:r>
+              <w:t xml:space="preserve">2. อภิปรายกลไกที่อยู่เบื้องหลังอาการ</w:t>
+            </w:r>
+            <w:r>
+              <w:t xml:space="preserve"/>
             </w:r>
             <w:r>
               <w:rPr>
@@ -1515,7 +1551,7 @@
               <w:jc w:val="left"/>
             </w:pPr>
             <w:r>
-              <w:t xml:space="preserve">สรุปและถาม-ตอบ</w:t>
+              <w:t xml:space="preserve">ทบทวนประเด็นสำคัญและตอบข้อซักถามได้</w:t>
             </w:r>
             <w:r>
               <w:rPr>
@@ -1550,7 +1586,19 @@
               <w:jc w:val="left"/>
             </w:pPr>
             <w:r>
-              <w:t xml:space="preserve">สรุปประเด็นสำคัญ</w:t>
+              <w:t xml:space="preserve"/>
+            </w:r>
+            <w:r>
+              <w:t xml:space="preserve">- สรุป take-home points</w:t>
+            </w:r>
+            <w:r>
+              <w:br/>
+            </w:r>
+            <w:r>
+              <w:t xml:space="preserve">- แนะนำแหล่งอ่านเพิ่มเติม</w:t>
+            </w:r>
+            <w:r>
+              <w:t xml:space="preserve"/>
             </w:r>
             <w:r>
               <w:rPr>

</xml_diff>

<commit_message>
M1: compute ผลการเรียนรู้ column as PLO/CLO pairs from cloRefs + CLO->PLO map
</commit_message>
<xml_diff>
--- a/render_proof.docx
+++ b/render_proof.docx
@@ -520,7 +520,7 @@
               <w:jc w:val="left"/>
             </w:pPr>
             <w:r>
-              <w:t xml:space="preserve">1.1</w:t>
+              <w:t xml:space="preserve">PLO4/CLO1</w:t>
             </w:r>
             <w:r>
               <w:rPr>
@@ -852,7 +852,7 @@
               <w:jc w:val="left"/>
             </w:pPr>
             <w:r>
-              <w:t xml:space="preserve">1.2</w:t>
+              <w:t xml:space="preserve">PLO4/CLO2</w:t>
             </w:r>
             <w:r>
               <w:rPr>
@@ -1184,7 +1184,17 @@
               <w:jc w:val="left"/>
             </w:pPr>
             <w:r>
-              <w:t xml:space="preserve">1.1, 1.2</w:t>
+              <w:t xml:space="preserve">
+                <w:r>
+                  <w:t xml:space="preserve">PLO4/CLO1</w:t>
+                </w:r>
+                <w:r>
+                  <w:br/>
+                </w:r>
+                <w:r>
+                  <w:t xml:space="preserve">PLO4/CLO2</w:t>
+                </w:r>
+              </w:t>
             </w:r>
             <w:r>
               <w:rPr>
@@ -1516,7 +1526,7 @@
               <w:jc w:val="left"/>
             </w:pPr>
             <w:r>
-              <w:t xml:space="preserve">1.1, 1.2</w:t>
+              <w:t xml:space="preserve">-</w:t>
             </w:r>
             <w:r>
               <w:rPr>
@@ -1853,7 +1863,7 @@
           <w:b w:val="0"/>
           <w:sz w:val="26"/>
         </w:rPr>
-        <w:t xml:space="preserve">PLO 1 : สามารถอธิบายกลไกการทำงานของระบบต่าง ๆ ในร่างกายมนุษย์ได้</w:t>
+        <w:t xml:space="preserve">PLO4 : สามารถอธิบายกลไกการทำงานของระบบต่าง ๆ ในร่างกายมนุษย์ได้</w:t>
       </w:r>
     </w:p>
     <w:p>
@@ -1867,7 +1877,7 @@
           <w:b w:val="0"/>
           <w:sz w:val="26"/>
         </w:rPr>
-        <w:t xml:space="preserve">CLO 1.1 : อธิบายโครงสร้างและหน้าที่ของระบบประสาทอัตโนมัติ</w:t>
+        <w:t xml:space="preserve">CLO1 : อธิบายโครงสร้างและหน้าที่ของระบบประสาทอัตโนมัติ</w:t>
       </w:r>
     </w:p>
     <w:p>
@@ -1881,7 +1891,7 @@
           <w:b w:val="0"/>
           <w:sz w:val="26"/>
         </w:rPr>
-        <w:t xml:space="preserve">CLO 1.2 : วิเคราะห์ความแตกต่างระหว่าง sympathetic และ parasympathetic</w:t>
+        <w:t xml:space="preserve">CLO2 : วิเคราะห์ความแตกต่างระหว่าง sympathetic และ parasympathetic</w:t>
       </w:r>
     </w:p>
     <w:p>

</xml_diff>